<commit_message>
added more new templates
</commit_message>
<xml_diff>
--- a/backend/data/Fristgerechte_Kündigung 1&1 DSL.docx
+++ b/backend/data/Fristgerechte_Kündigung 1&1 DSL.docx
@@ -1071,7 +1071,19 @@
         <w:rPr>
           <w:rFonts w:ascii="Calibri" w:hAnsi="Calibri" w:cs="Calibri"/>
         </w:rPr>
-        <w:t>{"name":"Fristdatum","type":"date","offset":30,"min_offset":30},</w:t>
+        <w:t>{"name":"Vertragstyp","type":"string","default":"</w:t>
+      </w:r>
+      <w:r>
+        <w:rPr>
+          <w:rFonts w:ascii="Calibri" w:hAnsi="Calibri" w:cs="Calibri"/>
+        </w:rPr>
+        <w:t>DSL</w:t>
+      </w:r>
+      <w:r>
+        <w:rPr>
+          <w:rFonts w:ascii="Calibri" w:hAnsi="Calibri" w:cs="Calibri"/>
+        </w:rPr>
+        <w:t>","optional":1},</w:t>
       </w:r>
     </w:p>
     <w:p>
@@ -1084,19 +1096,7 @@
         <w:rPr>
           <w:rFonts w:ascii="Calibri" w:hAnsi="Calibri" w:cs="Calibri"/>
         </w:rPr>
-        <w:t xml:space="preserve">        {"name":"Vertragstyp","type":"string","default":"</w:t>
-      </w:r>
-      <w:r>
-        <w:rPr>
-          <w:rFonts w:ascii="Calibri" w:hAnsi="Calibri" w:cs="Calibri"/>
-        </w:rPr>
-        <w:t>DSL</w:t>
-      </w:r>
-      <w:r>
-        <w:rPr>
-          <w:rFonts w:ascii="Calibri" w:hAnsi="Calibri" w:cs="Calibri"/>
-        </w:rPr>
-        <w:t>","optional":1},</w:t>
+        <w:t xml:space="preserve">        {"name":"Kundenummer","type":"number"},</w:t>
       </w:r>
     </w:p>
     <w:p>
@@ -1109,7 +1109,7 @@
         <w:rPr>
           <w:rFonts w:ascii="Calibri" w:hAnsi="Calibri" w:cs="Calibri"/>
         </w:rPr>
-        <w:t xml:space="preserve">        {"name":"Kundenummer","type":"number"},</w:t>
+        <w:t xml:space="preserve">        {"name":"Vertragsnummer","type":"number","optional":1},</w:t>
       </w:r>
     </w:p>
     <w:p>
@@ -1122,7 +1122,19 @@
         <w:rPr>
           <w:rFonts w:ascii="Calibri" w:hAnsi="Calibri" w:cs="Calibri"/>
         </w:rPr>
-        <w:t xml:space="preserve">        {"name":"Vertragsnummer","type":"number","optional":1},</w:t>
+        <w:t xml:space="preserve">        {"name":"</w:t>
+      </w:r>
+      <w:r>
+        <w:rPr>
+          <w:rFonts w:ascii="Calibri" w:hAnsi="Calibri" w:cs="Calibri"/>
+        </w:rPr>
+        <w:t>Mobilnummer</w:t>
+      </w:r>
+      <w:r>
+        <w:rPr>
+          <w:rFonts w:ascii="Calibri" w:hAnsi="Calibri" w:cs="Calibri"/>
+        </w:rPr>
+        <w:t>","type":"number","optional":1},</w:t>
       </w:r>
     </w:p>
     <w:p>
@@ -1135,19 +1147,13 @@
         <w:rPr>
           <w:rFonts w:ascii="Calibri" w:hAnsi="Calibri" w:cs="Calibri"/>
         </w:rPr>
-        <w:t xml:space="preserve">        {"name":"</w:t>
-      </w:r>
-      <w:r>
-        <w:rPr>
-          <w:rFonts w:ascii="Calibri" w:hAnsi="Calibri" w:cs="Calibri"/>
-        </w:rPr>
-        <w:t>Mobilnummer</w:t>
-      </w:r>
-      <w:r>
-        <w:rPr>
-          <w:rFonts w:ascii="Calibri" w:hAnsi="Calibri" w:cs="Calibri"/>
-        </w:rPr>
-        <w:t>","type":"number","optional":1},</w:t>
+        <w:t xml:space="preserve">        </w:t>
+      </w:r>
+      <w:r>
+        <w:rPr>
+          <w:rFonts w:ascii="Calibri" w:hAnsi="Calibri" w:cs="Calibri"/>
+        </w:rPr>
+        <w:t>{"name":"Festnetznummer","type":"number","optional":1}</w:t>
       </w:r>
     </w:p>
     <w:p>
@@ -1160,13 +1166,7 @@
         <w:rPr>
           <w:rFonts w:ascii="Calibri" w:hAnsi="Calibri" w:cs="Calibri"/>
         </w:rPr>
-        <w:t xml:space="preserve">        </w:t>
-      </w:r>
-      <w:r>
-        <w:rPr>
-          <w:rFonts w:ascii="Calibri" w:hAnsi="Calibri" w:cs="Calibri"/>
-        </w:rPr>
-        <w:t>{"name":"Festnetznummer","type":"number","optional":1}</w:t>
+        <w:t xml:space="preserve">    ]) %</w:t>
       </w:r>
     </w:p>
     <w:p>
@@ -1179,7 +1179,7 @@
         <w:rPr>
           <w:rFonts w:ascii="Calibri" w:hAnsi="Calibri" w:cs="Calibri"/>
         </w:rPr>
-        <w:t xml:space="preserve">    ]) %</w:t>
+        <w:t>}{% set _=meta([</w:t>
       </w:r>
     </w:p>
     <w:p>
@@ -1192,7 +1192,61 @@
         <w:rPr>
           <w:rFonts w:ascii="Calibri" w:hAnsi="Calibri" w:cs="Calibri"/>
         </w:rPr>
-        <w:t>}{% set _=meta([</w:t>
+        <w:t xml:space="preserve">        {"name":"</w:t>
+      </w:r>
+      <w:r>
+        <w:rPr>
+          <w:rFonts w:ascii="Calibri" w:hAnsi="Calibri" w:cs="Calibri"/>
+        </w:rPr>
+        <w:t>Fristgerechte</w:t>
+      </w:r>
+      <w:r>
+        <w:rPr>
+          <w:rFonts w:ascii="Calibri" w:hAnsi="Calibri" w:cs="Calibri"/>
+        </w:rPr>
+        <w:t xml:space="preserve"> K</w:t>
+      </w:r>
+      <w:r>
+        <w:rPr>
+          <w:rFonts w:ascii="Calibri" w:hAnsi="Calibri" w:cs="Calibri"/>
+        </w:rPr>
+        <w:t>ündigung</w:t>
+      </w:r>
+      <w:r>
+        <w:rPr>
+          <w:rFonts w:ascii="Calibri" w:hAnsi="Calibri" w:cs="Calibri"/>
+        </w:rPr>
+        <w:t xml:space="preserve"> </w:t>
+      </w:r>
+      <w:r>
+        <w:rPr>
+          <w:rFonts w:ascii="Calibri" w:hAnsi="Calibri" w:cs="Calibri"/>
+        </w:rPr>
+        <w:t>1&amp;1</w:t>
+      </w:r>
+      <w:r>
+        <w:rPr>
+          <w:rFonts w:ascii="Calibri" w:hAnsi="Calibri" w:cs="Calibri"/>
+        </w:rPr>
+        <w:t xml:space="preserve"> DSL</w:t>
+      </w:r>
+      <w:r>
+        <w:rPr>
+          <w:rFonts w:ascii="Calibri" w:hAnsi="Calibri" w:cs="Calibri"/>
+        </w:rPr>
+        <w:t>","version":"1.</w:t>
+      </w:r>
+      <w:r>
+        <w:rPr>
+          <w:rFonts w:ascii="Calibri" w:hAnsi="Calibri" w:cs="Calibri"/>
+        </w:rPr>
+        <w:t>0</w:t>
+      </w:r>
+      <w:r>
+        <w:rPr>
+          <w:rFonts w:ascii="Calibri" w:hAnsi="Calibri" w:cs="Calibri"/>
+        </w:rPr>
+        <w:t>","creator":"Yuvraj",</w:t>
       </w:r>
     </w:p>
     <w:p>
@@ -1205,7 +1259,13 @@
         <w:rPr>
           <w:rFonts w:ascii="Calibri" w:hAnsi="Calibri" w:cs="Calibri"/>
         </w:rPr>
-        <w:t xml:space="preserve">        {"name":"</w:t>
+        <w:t xml:space="preserve">            </w:t>
+      </w:r>
+      <w:r>
+        <w:rPr>
+          <w:rFonts w:ascii="Calibri" w:hAnsi="Calibri" w:cs="Calibri"/>
+        </w:rPr>
+        <w:t>"category":["</w:t>
       </w:r>
       <w:r>
         <w:rPr>
@@ -1235,37 +1295,7 @@
         <w:rPr>
           <w:rFonts w:ascii="Calibri" w:hAnsi="Calibri" w:cs="Calibri"/>
         </w:rPr>
-        <w:t xml:space="preserve"> </w:t>
-      </w:r>
-      <w:r>
-        <w:rPr>
-          <w:rFonts w:ascii="Calibri" w:hAnsi="Calibri" w:cs="Calibri"/>
-        </w:rPr>
-        <w:t>1&amp;1</w:t>
-      </w:r>
-      <w:r>
-        <w:rPr>
-          <w:rFonts w:ascii="Calibri" w:hAnsi="Calibri" w:cs="Calibri"/>
-        </w:rPr>
-        <w:t xml:space="preserve"> DSL</w:t>
-      </w:r>
-      <w:r>
-        <w:rPr>
-          <w:rFonts w:ascii="Calibri" w:hAnsi="Calibri" w:cs="Calibri"/>
-        </w:rPr>
-        <w:t>","version":"1.</w:t>
-      </w:r>
-      <w:r>
-        <w:rPr>
-          <w:rFonts w:ascii="Calibri" w:hAnsi="Calibri" w:cs="Calibri"/>
-        </w:rPr>
-        <w:t>0</w:t>
-      </w:r>
-      <w:r>
-        <w:rPr>
-          <w:rFonts w:ascii="Calibri" w:hAnsi="Calibri" w:cs="Calibri"/>
-        </w:rPr>
-        <w:t>","creator":"Yuvraj",</w:t>
+        <w:t>"],</w:t>
       </w:r>
     </w:p>
     <w:p>
@@ -1278,13 +1308,7 @@
         <w:rPr>
           <w:rFonts w:ascii="Calibri" w:hAnsi="Calibri" w:cs="Calibri"/>
         </w:rPr>
-        <w:t xml:space="preserve">            </w:t>
-      </w:r>
-      <w:r>
-        <w:rPr>
-          <w:rFonts w:ascii="Calibri" w:hAnsi="Calibri" w:cs="Calibri"/>
-        </w:rPr>
-        <w:t>"category":["</w:t>
+        <w:t xml:space="preserve">            "tags":["</w:t>
       </w:r>
       <w:r>
         <w:rPr>
@@ -1302,7 +1326,73 @@
         <w:rPr>
           <w:rFonts w:ascii="Calibri" w:hAnsi="Calibri" w:cs="Calibri"/>
         </w:rPr>
-        <w:t>"],</w:t>
+        <w:t>","</w:t>
+      </w:r>
+      <w:r>
+        <w:rPr>
+          <w:rFonts w:ascii="Calibri" w:hAnsi="Calibri" w:cs="Calibri"/>
+        </w:rPr>
+        <w:t>1</w:t>
+      </w:r>
+      <w:r>
+        <w:rPr>
+          <w:rFonts w:ascii="Calibri" w:hAnsi="Calibri" w:cs="Calibri"/>
+        </w:rPr>
+        <w:t>&amp;</w:t>
+      </w:r>
+      <w:r>
+        <w:rPr>
+          <w:rFonts w:ascii="Calibri" w:hAnsi="Calibri" w:cs="Calibri"/>
+        </w:rPr>
+        <w:t>1</w:t>
+      </w:r>
+      <w:r>
+        <w:rPr>
+          <w:rFonts w:ascii="Calibri" w:hAnsi="Calibri" w:cs="Calibri"/>
+        </w:rPr>
+        <w:t>"</w:t>
+      </w:r>
+      <w:r>
+        <w:rPr>
+          <w:rFonts w:ascii="Calibri" w:hAnsi="Calibri" w:cs="Calibri"/>
+        </w:rPr>
+        <w:t>,"</w:t>
+      </w:r>
+      <w:r>
+        <w:rPr>
+          <w:rFonts w:ascii="Calibri" w:hAnsi="Calibri" w:cs="Calibri"/>
+        </w:rPr>
+        <w:t>DSL</w:t>
+      </w:r>
+      <w:r>
+        <w:rPr>
+          <w:rFonts w:ascii="Calibri" w:hAnsi="Calibri" w:cs="Calibri"/>
+        </w:rPr>
+        <w:t>"</w:t>
+      </w:r>
+      <w:r>
+        <w:rPr>
+          <w:rFonts w:ascii="Calibri" w:hAnsi="Calibri" w:cs="Calibri"/>
+        </w:rPr>
+        <w:t>,“</w:t>
+      </w:r>
+      <w:r>
+        <w:rPr>
+          <w:rFonts w:ascii="Calibri" w:hAnsi="Calibri" w:cs="Calibri"/>
+        </w:rPr>
+        <w:t>Fristgerechte</w:t>
+      </w:r>
+      <w:r>
+        <w:rPr>
+          <w:rFonts w:ascii="Calibri" w:hAnsi="Calibri" w:cs="Calibri"/>
+        </w:rPr>
+        <w:t>“</w:t>
+      </w:r>
+      <w:r>
+        <w:rPr>
+          <w:rFonts w:ascii="Calibri" w:hAnsi="Calibri" w:cs="Calibri"/>
+        </w:rPr>
+        <w:t>],</w:t>
       </w:r>
     </w:p>
     <w:p>
@@ -1315,25 +1405,13 @@
         <w:rPr>
           <w:rFonts w:ascii="Calibri" w:hAnsi="Calibri" w:cs="Calibri"/>
         </w:rPr>
-        <w:t xml:space="preserve">            "tags":["</w:t>
-      </w:r>
-      <w:r>
-        <w:rPr>
-          <w:rFonts w:ascii="Calibri" w:hAnsi="Calibri" w:cs="Calibri"/>
-        </w:rPr>
-        <w:t>K</w:t>
-      </w:r>
-      <w:r>
-        <w:rPr>
-          <w:rFonts w:ascii="Calibri" w:hAnsi="Calibri" w:cs="Calibri"/>
-        </w:rPr>
-        <w:t>ündigung</w:t>
-      </w:r>
-      <w:r>
-        <w:rPr>
-          <w:rFonts w:ascii="Calibri" w:hAnsi="Calibri" w:cs="Calibri"/>
-        </w:rPr>
-        <w:t>","</w:t>
+        <w:t xml:space="preserve">            </w:t>
+      </w:r>
+      <w:r>
+        <w:rPr>
+          <w:rFonts w:ascii="Calibri" w:hAnsi="Calibri" w:cs="Calibri"/>
+        </w:rPr>
+        <w:t>"provider":["</w:t>
       </w:r>
       <w:r>
         <w:rPr>
@@ -1357,13 +1435,26 @@
         <w:rPr>
           <w:rFonts w:ascii="Calibri" w:hAnsi="Calibri" w:cs="Calibri"/>
         </w:rPr>
-        <w:t>"</w:t>
-      </w:r>
-      <w:r>
-        <w:rPr>
-          <w:rFonts w:ascii="Calibri" w:hAnsi="Calibri" w:cs="Calibri"/>
-        </w:rPr>
-        <w:t>,"</w:t>
+        <w:t>"]</w:t>
+      </w:r>
+      <w:r>
+        <w:rPr>
+          <w:rFonts w:ascii="Calibri" w:hAnsi="Calibri" w:cs="Calibri"/>
+        </w:rPr>
+        <w:t>,</w:t>
+      </w:r>
+      <w:r>
+        <w:rPr>
+          <w:rFonts w:ascii="Calibri" w:hAnsi="Calibri" w:cs="Calibri"/>
+        </w:rPr>
+        <w:br/>
+      </w:r>
+      <w:r>
+        <w:rPr>
+          <w:rFonts w:ascii="Calibri" w:hAnsi="Calibri" w:cs="Calibri"/>
+        </w:rPr>
+        <w:tab/>
+        <w:t>"vertragstyp":["</w:t>
       </w:r>
       <w:r>
         <w:rPr>
@@ -1375,105 +1466,28 @@
         <w:rPr>
           <w:rFonts w:ascii="Calibri" w:hAnsi="Calibri" w:cs="Calibri"/>
         </w:rPr>
-        <w:t>"</w:t>
-      </w:r>
-      <w:r>
-        <w:rPr>
-          <w:rFonts w:ascii="Calibri" w:hAnsi="Calibri" w:cs="Calibri"/>
-        </w:rPr>
-        <w:t>,“</w:t>
-      </w:r>
-      <w:r>
-        <w:rPr>
-          <w:rFonts w:ascii="Calibri" w:hAnsi="Calibri" w:cs="Calibri"/>
-        </w:rPr>
-        <w:t>Fristgerechte</w:t>
-      </w:r>
-      <w:r>
-        <w:rPr>
-          <w:rFonts w:ascii="Calibri" w:hAnsi="Calibri" w:cs="Calibri"/>
-        </w:rPr>
-        <w:t>“</w:t>
-      </w:r>
-      <w:r>
-        <w:rPr>
-          <w:rFonts w:ascii="Calibri" w:hAnsi="Calibri" w:cs="Calibri"/>
-        </w:rPr>
-        <w:t>],</w:t>
+        <w:t>"]</w:t>
       </w:r>
     </w:p>
     <w:p>
       <w:pPr>
         <w:rPr>
           <w:rFonts w:ascii="Calibri" w:hAnsi="Calibri" w:cs="Calibri"/>
+          <w:lang w:val="en-US"/>
         </w:rPr>
       </w:pPr>
       <w:r>
         <w:rPr>
           <w:rFonts w:ascii="Calibri" w:hAnsi="Calibri" w:cs="Calibri"/>
         </w:rPr>
-        <w:t xml:space="preserve">            </w:t>
-      </w:r>
-      <w:r>
-        <w:rPr>
-          <w:rFonts w:ascii="Calibri" w:hAnsi="Calibri" w:cs="Calibri"/>
-        </w:rPr>
-        <w:t>"provider":["</w:t>
-      </w:r>
-      <w:r>
-        <w:rPr>
-          <w:rFonts w:ascii="Calibri" w:hAnsi="Calibri" w:cs="Calibri"/>
-        </w:rPr>
-        <w:t>1</w:t>
-      </w:r>
-      <w:r>
-        <w:rPr>
-          <w:rFonts w:ascii="Calibri" w:hAnsi="Calibri" w:cs="Calibri"/>
-        </w:rPr>
-        <w:t>&amp;</w:t>
-      </w:r>
-      <w:r>
-        <w:rPr>
-          <w:rFonts w:ascii="Calibri" w:hAnsi="Calibri" w:cs="Calibri"/>
-        </w:rPr>
-        <w:t>1</w:t>
-      </w:r>
-      <w:r>
-        <w:rPr>
-          <w:rFonts w:ascii="Calibri" w:hAnsi="Calibri" w:cs="Calibri"/>
-        </w:rPr>
-        <w:t>"]</w:t>
-      </w:r>
-      <w:r>
-        <w:rPr>
-          <w:rFonts w:ascii="Calibri" w:hAnsi="Calibri" w:cs="Calibri"/>
-        </w:rPr>
-        <w:t>,</w:t>
-      </w:r>
-      <w:r>
-        <w:rPr>
-          <w:rFonts w:ascii="Calibri" w:hAnsi="Calibri" w:cs="Calibri"/>
-        </w:rPr>
-        <w:br/>
-      </w:r>
-      <w:r>
-        <w:rPr>
-          <w:rFonts w:ascii="Calibri" w:hAnsi="Calibri" w:cs="Calibri"/>
-        </w:rPr>
-        <w:tab/>
-        <w:t>"vertragstyp":["</w:t>
-      </w:r>
-      <w:r>
-        <w:rPr>
-          <w:rFonts w:ascii="Calibri" w:hAnsi="Calibri" w:cs="Calibri"/>
-        </w:rPr>
-        <w:t>DSL</w:t>
-      </w:r>
-      <w:r>
-        <w:rPr>
-          <w:rFonts w:ascii="Calibri" w:hAnsi="Calibri" w:cs="Calibri"/>
-        </w:rPr>
-        <w:t>"]</w:t>
+        <w:t xml:space="preserve">        </w:t>
+      </w:r>
+      <w:r>
+        <w:rPr>
+          <w:rFonts w:ascii="Calibri" w:hAnsi="Calibri" w:cs="Calibri"/>
+          <w:lang w:val="en-US"/>
+        </w:rPr>
+        <w:t>}</w:t>
       </w:r>
     </w:p>
     <w:p>
@@ -1486,15 +1500,9 @@
       <w:r>
         <w:rPr>
           <w:rFonts w:ascii="Calibri" w:hAnsi="Calibri" w:cs="Calibri"/>
-        </w:rPr>
-        <w:t xml:space="preserve">        </w:t>
-      </w:r>
-      <w:r>
-        <w:rPr>
-          <w:rFonts w:ascii="Calibri" w:hAnsi="Calibri" w:cs="Calibri"/>
           <w:lang w:val="en-US"/>
         </w:rPr>
-        <w:t>}</w:t>
+        <w:t xml:space="preserve">    ])%</w:t>
       </w:r>
     </w:p>
     <w:p>
@@ -1509,7 +1517,7 @@
           <w:rFonts w:ascii="Calibri" w:hAnsi="Calibri" w:cs="Calibri"/>
           <w:lang w:val="en-US"/>
         </w:rPr>
-        <w:t xml:space="preserve">    ])%</w:t>
+        <w:t>}{% set _=layout([</w:t>
       </w:r>
     </w:p>
     <w:p>
@@ -1524,7 +1532,14 @@
           <w:rFonts w:ascii="Calibri" w:hAnsi="Calibri" w:cs="Calibri"/>
           <w:lang w:val="en-US"/>
         </w:rPr>
-        <w:t>}{% set _=layout([</w:t>
+        <w:t xml:space="preserve">        </w:t>
+      </w:r>
+      <w:r>
+        <w:rPr>
+          <w:rFonts w:ascii="Calibri" w:hAnsi="Calibri" w:cs="Calibri"/>
+          <w:lang w:val="en-US"/>
+        </w:rPr>
+        <w:t>{"Stammdaten":[</w:t>
       </w:r>
     </w:p>
     <w:p>
@@ -1539,29 +1554,27 @@
           <w:rFonts w:ascii="Calibri" w:hAnsi="Calibri" w:cs="Calibri"/>
           <w:lang w:val="en-US"/>
         </w:rPr>
-        <w:t xml:space="preserve">        </w:t>
-      </w:r>
-      <w:r>
-        <w:rPr>
-          <w:rFonts w:ascii="Calibri" w:hAnsi="Calibri" w:cs="Calibri"/>
-          <w:lang w:val="en-US"/>
-        </w:rPr>
-        <w:t>{"Stammdaten":[</w:t>
+        <w:t xml:space="preserve">                ["Vorname","Name"],</w:t>
       </w:r>
     </w:p>
     <w:p>
       <w:pPr>
         <w:rPr>
           <w:rFonts w:ascii="Calibri" w:hAnsi="Calibri" w:cs="Calibri"/>
+        </w:rPr>
+      </w:pPr>
+      <w:r>
+        <w:rPr>
+          <w:rFonts w:ascii="Calibri" w:hAnsi="Calibri" w:cs="Calibri"/>
           <w:lang w:val="en-US"/>
         </w:rPr>
-      </w:pPr>
-      <w:r>
-        <w:rPr>
-          <w:rFonts w:ascii="Calibri" w:hAnsi="Calibri" w:cs="Calibri"/>
-          <w:lang w:val="en-US"/>
-        </w:rPr>
-        <w:t xml:space="preserve">                ["Vorname","Name"],</w:t>
+        <w:t xml:space="preserve">                </w:t>
+      </w:r>
+      <w:r>
+        <w:rPr>
+          <w:rFonts w:ascii="Calibri" w:hAnsi="Calibri" w:cs="Calibri"/>
+        </w:rPr>
+        <w:t>["Strasse","Hausnummer","PLZ","Stadt"]</w:t>
       </w:r>
     </w:p>
     <w:p>
@@ -1573,15 +1586,8 @@
       <w:r>
         <w:rPr>
           <w:rFonts w:ascii="Calibri" w:hAnsi="Calibri" w:cs="Calibri"/>
-          <w:lang w:val="en-US"/>
-        </w:rPr>
-        <w:t xml:space="preserve">                </w:t>
-      </w:r>
-      <w:r>
-        <w:rPr>
-          <w:rFonts w:ascii="Calibri" w:hAnsi="Calibri" w:cs="Calibri"/>
-        </w:rPr>
-        <w:t>["Strasse","Hausnummer","PLZ","Stadt"]</w:t>
+        </w:rPr>
+        <w:t xml:space="preserve">            ]</w:t>
       </w:r>
     </w:p>
     <w:p>
@@ -1594,7 +1600,7 @@
         <w:rPr>
           <w:rFonts w:ascii="Calibri" w:hAnsi="Calibri" w:cs="Calibri"/>
         </w:rPr>
-        <w:t xml:space="preserve">            ]</w:t>
+        <w:t xml:space="preserve">        },</w:t>
       </w:r>
     </w:p>
     <w:p>
@@ -1607,7 +1613,7 @@
         <w:rPr>
           <w:rFonts w:ascii="Calibri" w:hAnsi="Calibri" w:cs="Calibri"/>
         </w:rPr>
-        <w:t xml:space="preserve">        },</w:t>
+        <w:t xml:space="preserve">        {"Daten":[</w:t>
       </w:r>
     </w:p>
     <w:p>
@@ -1620,7 +1626,31 @@
         <w:rPr>
           <w:rFonts w:ascii="Calibri" w:hAnsi="Calibri" w:cs="Calibri"/>
         </w:rPr>
-        <w:t xml:space="preserve">        {"Daten":[</w:t>
+        <w:t xml:space="preserve">                ["Kundenummer","</w:t>
+      </w:r>
+      <w:r>
+        <w:rPr>
+          <w:rFonts w:ascii="Calibri" w:hAnsi="Calibri" w:cs="Calibri"/>
+        </w:rPr>
+        <w:t>Festnetznummer</w:t>
+      </w:r>
+      <w:r>
+        <w:rPr>
+          <w:rFonts w:ascii="Calibri" w:hAnsi="Calibri" w:cs="Calibri"/>
+        </w:rPr>
+        <w:t>","</w:t>
+      </w:r>
+      <w:r>
+        <w:rPr>
+          <w:rFonts w:ascii="Calibri" w:hAnsi="Calibri" w:cs="Calibri"/>
+        </w:rPr>
+        <w:t>Vertragstyp</w:t>
+      </w:r>
+      <w:r>
+        <w:rPr>
+          <w:rFonts w:ascii="Calibri" w:hAnsi="Calibri" w:cs="Calibri"/>
+        </w:rPr>
+        <w:t>"],</w:t>
       </w:r>
     </w:p>
     <w:p>
@@ -1634,43 +1664,6 @@
           <w:rFonts w:ascii="Calibri" w:hAnsi="Calibri" w:cs="Calibri"/>
         </w:rPr>
         <w:lastRenderedPageBreak/>
-        <w:t xml:space="preserve">                ["Kundenummer","</w:t>
-      </w:r>
-      <w:r>
-        <w:rPr>
-          <w:rFonts w:ascii="Calibri" w:hAnsi="Calibri" w:cs="Calibri"/>
-        </w:rPr>
-        <w:t>Festnetznummer</w:t>
-      </w:r>
-      <w:r>
-        <w:rPr>
-          <w:rFonts w:ascii="Calibri" w:hAnsi="Calibri" w:cs="Calibri"/>
-        </w:rPr>
-        <w:t>","</w:t>
-      </w:r>
-      <w:r>
-        <w:rPr>
-          <w:rFonts w:ascii="Calibri" w:hAnsi="Calibri" w:cs="Calibri"/>
-        </w:rPr>
-        <w:t>Vertragstyp</w:t>
-      </w:r>
-      <w:r>
-        <w:rPr>
-          <w:rFonts w:ascii="Calibri" w:hAnsi="Calibri" w:cs="Calibri"/>
-        </w:rPr>
-        <w:t>"],</w:t>
-      </w:r>
-    </w:p>
-    <w:p>
-      <w:pPr>
-        <w:rPr>
-          <w:rFonts w:ascii="Calibri" w:hAnsi="Calibri" w:cs="Calibri"/>
-        </w:rPr>
-      </w:pPr>
-      <w:r>
-        <w:rPr>
-          <w:rFonts w:ascii="Calibri" w:hAnsi="Calibri" w:cs="Calibri"/>
-        </w:rPr>
         <w:t xml:space="preserve">                </w:t>
       </w:r>
       <w:r>

</xml_diff>